<commit_message>
Update defense documentation now that the README gap is closed
Criterion 6 self-score moves from 8/10 to 10/10 and the 16-item README
checklist now shows all items closed (2026-08-18), matching the
README.md update in 44da84a. Overall self-assessed total updated from
~83-84 to ~85-87.
</commit_message>
<xml_diff>
--- a/Traffic_Sign_Recognition_Defense_Documentation.docx
+++ b/Traffic_Sign_Recognition_Defense_Documentation.docx
@@ -3371,7 +3371,74 @@
               <w:t xml:space="preserve"> </w:t>
             </w:r>
             <w:r>
-              <w:t xml:space="preserve">(rewritten 2026-08-18) explains the project, results, architecture, and repo layout clearly —</w:t>
+              <w:t xml:space="preserve">explains the project, results, architecture, repo layout, track, ML task type, and author clearly — updated 2026-08-18 to close every item in the rubric’s 16-item checklist below.</w:t>
+            </w:r>
+          </w:p>
+        </w:tc>
+        <w:tc>
+          <w:tcPr/>
+          <w:p>
+            <w:pPr>
+              <w:pStyle w:val="Compact"/>
+            </w:pPr>
+            <w:r>
+              <w:t xml:space="preserve">3/3</w:t>
+            </w:r>
+          </w:p>
+        </w:tc>
+      </w:tr>
+      <w:tr>
+        <w:tc>
+          <w:tcPr/>
+          <w:p>
+            <w:pPr>
+              <w:pStyle w:val="Compact"/>
+            </w:pPr>
+            <w:r>
+              <w:t xml:space="preserve">Setup &amp; run instructions</w:t>
+            </w:r>
+          </w:p>
+        </w:tc>
+        <w:tc>
+          <w:tcPr/>
+          <w:p>
+            <w:pPr>
+              <w:pStyle w:val="Compact"/>
+            </w:pPr>
+            <w:r>
+              <w:t xml:space="preserve">3</w:t>
+            </w:r>
+          </w:p>
+        </w:tc>
+        <w:tc>
+          <w:tcPr/>
+          <w:p>
+            <w:pPr>
+              <w:pStyle w:val="Compact"/>
+            </w:pPr>
+            <w:r>
+              <w:t xml:space="preserve">Root README + three component READMEs (</w:t>
+            </w:r>
+            <w:r>
+              <w:rPr>
+                <w:rStyle w:val="VerbatimChar"/>
+              </w:rPr>
+              <w:t xml:space="preserve">video_detection/</w:t>
+            </w:r>
+            <w:r>
+              <w:t xml:space="preserve">,</w:t>
+            </w:r>
+            <w:r>
+              <w:t xml:space="preserve"> </w:t>
+            </w:r>
+            <w:r>
+              <w:rPr>
+                <w:rStyle w:val="VerbatimChar"/>
+              </w:rPr>
+              <w:t xml:space="preserve">streamlit_app/</w:t>
+            </w:r>
+            <w:r>
+              <w:t xml:space="preserve">) give copy-pasteable, verified commands for both</w:t>
             </w:r>
             <w:r>
               <w:t xml:space="preserve"> </w:t>
@@ -3381,80 +3448,13 @@
                 <w:b/>
                 <w:bCs/>
               </w:rPr>
-              <w:t xml:space="preserve">but does not yet cover every one of the rubric’s 16 specific required README items</w:t>
-            </w:r>
-            <w:r>
-              <w:t xml:space="preserve"> </w:t>
-            </w:r>
-            <w:r>
-              <w:t xml:space="preserve">(see the checklist below).</w:t>
-            </w:r>
-          </w:p>
-        </w:tc>
-        <w:tc>
-          <w:tcPr/>
-          <w:p>
-            <w:pPr>
-              <w:pStyle w:val="Compact"/>
-            </w:pPr>
-            <w:r>
-              <w:t xml:space="preserve">2/3</w:t>
-            </w:r>
-          </w:p>
-        </w:tc>
-      </w:tr>
-      <w:tr>
-        <w:tc>
-          <w:tcPr/>
-          <w:p>
-            <w:pPr>
-              <w:pStyle w:val="Compact"/>
-            </w:pPr>
-            <w:r>
-              <w:t xml:space="preserve">Setup &amp; run instructions</w:t>
-            </w:r>
-          </w:p>
-        </w:tc>
-        <w:tc>
-          <w:tcPr/>
-          <w:p>
-            <w:pPr>
-              <w:pStyle w:val="Compact"/>
-            </w:pPr>
-            <w:r>
-              <w:t xml:space="preserve">3</w:t>
-            </w:r>
-          </w:p>
-        </w:tc>
-        <w:tc>
-          <w:tcPr/>
-          <w:p>
-            <w:pPr>
-              <w:pStyle w:val="Compact"/>
-            </w:pPr>
-            <w:r>
-              <w:t xml:space="preserve">Root README + three component READMEs (</w:t>
-            </w:r>
-            <w:r>
-              <w:rPr>
-                <w:rStyle w:val="VerbatimChar"/>
-              </w:rPr>
-              <w:t xml:space="preserve">video_detection/</w:t>
-            </w:r>
-            <w:r>
-              <w:t xml:space="preserve">,</w:t>
-            </w:r>
-            <w:r>
-              <w:t xml:space="preserve"> </w:t>
-            </w:r>
-            <w:r>
-              <w:rPr>
-                <w:rStyle w:val="VerbatimChar"/>
-              </w:rPr>
-              <w:t xml:space="preserve">streamlit_app/</w:t>
-            </w:r>
-            <w:r>
-              <w:t xml:space="preserve">) all give copy-pasteable, verified commands — but only for</w:t>
+              <w:t xml:space="preserve">running</w:t>
+            </w:r>
+            <w:r>
+              <w:t xml:space="preserve"> </w:t>
+            </w:r>
+            <w:r>
+              <w:t xml:space="preserve">the demo and</w:t>
             </w:r>
             <w:r>
               <w:t xml:space="preserve"> </w:t>
@@ -3464,170 +3464,172 @@
                 <w:b/>
                 <w:bCs/>
               </w:rPr>
-              <w:t xml:space="preserve">inference/running the demo</w:t>
-            </w:r>
-            <w:r>
-              <w:t xml:space="preserve">, not for</w:t>
-            </w:r>
-            <w:r>
-              <w:t xml:space="preserve"> </w:t>
-            </w:r>
+              <w:t xml:space="preserve">training/fine-tuning</w:t>
+            </w:r>
+            <w:r>
+              <w:t xml:space="preserve"> </w:t>
+            </w:r>
+            <w:r>
+              <w:t xml:space="preserve">the model (notebook order, Colab vs. Kaggle, added 2026-08-18).</w:t>
+            </w:r>
+          </w:p>
+        </w:tc>
+        <w:tc>
+          <w:tcPr/>
+          <w:p>
+            <w:pPr>
+              <w:pStyle w:val="Compact"/>
+            </w:pPr>
+            <w:r>
+              <w:t xml:space="preserve">3/3</w:t>
+            </w:r>
+          </w:p>
+        </w:tc>
+      </w:tr>
+      <w:tr>
+        <w:tc>
+          <w:tcPr/>
+          <w:p>
+            <w:pPr>
+              <w:pStyle w:val="Compact"/>
+            </w:pPr>
+            <w:r>
+              <w:t xml:space="preserve">Repository organization</w:t>
+            </w:r>
+          </w:p>
+        </w:tc>
+        <w:tc>
+          <w:tcPr/>
+          <w:p>
+            <w:pPr>
+              <w:pStyle w:val="Compact"/>
+            </w:pPr>
+            <w:r>
+              <w:t xml:space="preserve">2</w:t>
+            </w:r>
+          </w:p>
+        </w:tc>
+        <w:tc>
+          <w:tcPr/>
+          <w:p>
+            <w:pPr>
+              <w:pStyle w:val="Compact"/>
+            </w:pPr>
+            <w:r>
+              <w:t xml:space="preserve">Clean, deliberately isolated components (</w:t>
+            </w:r>
+            <w:r>
+              <w:rPr>
+                <w:rStyle w:val="VerbatimChar"/>
+              </w:rPr>
+              <w:t xml:space="preserve">video_detection/</w:t>
+            </w:r>
+            <w:r>
+              <w:t xml:space="preserve">,</w:t>
+            </w:r>
+            <w:r>
+              <w:t xml:space="preserve"> </w:t>
+            </w:r>
+            <w:r>
+              <w:rPr>
+                <w:rStyle w:val="VerbatimChar"/>
+              </w:rPr>
+              <w:t xml:space="preserve">streamlit_app/</w:t>
+            </w:r>
+            <w:r>
+              <w:t xml:space="preserve"> </w:t>
+            </w:r>
+            <w:r>
+              <w:t xml:space="preserve">each explicitly documented as read-only consumers of the trained model, never touching</w:t>
+            </w:r>
+            <w:r>
+              <w:t xml:space="preserve"> </w:t>
+            </w:r>
+            <w:r>
+              <w:rPr>
+                <w:rStyle w:val="VerbatimChar"/>
+              </w:rPr>
+              <w:t xml:space="preserve">bot.py</w:t>
+            </w:r>
+            <w:r>
+              <w:t xml:space="preserve">), consistent naming, no dead/orphaned files.</w:t>
+            </w:r>
+          </w:p>
+        </w:tc>
+        <w:tc>
+          <w:tcPr/>
+          <w:p>
+            <w:pPr>
+              <w:pStyle w:val="Compact"/>
+            </w:pPr>
+            <w:r>
+              <w:t xml:space="preserve">2/2</w:t>
+            </w:r>
+          </w:p>
+        </w:tc>
+      </w:tr>
+      <w:tr>
+        <w:tc>
+          <w:tcPr/>
+          <w:p>
+            <w:pPr>
+              <w:pStyle w:val="Compact"/>
+            </w:pPr>
+            <w:r>
+              <w:t xml:space="preserve">Reproducibility evidence</w:t>
+            </w:r>
+          </w:p>
+        </w:tc>
+        <w:tc>
+          <w:tcPr/>
+          <w:p>
+            <w:pPr>
+              <w:pStyle w:val="Compact"/>
+            </w:pPr>
+            <w:r>
+              <w:t xml:space="preserve">2</w:t>
+            </w:r>
+          </w:p>
+        </w:tc>
+        <w:tc>
+          <w:tcPr/>
+          <w:p>
+            <w:pPr>
+              <w:pStyle w:val="Compact"/>
+            </w:pPr>
+            <w:r>
+              <w:t xml:space="preserve">Multiple independent, verified reproduction paths: the live public web app (verified rendering today), and local run instructions for the bot/CLI/web app all confirmed working during development.</w:t>
+            </w:r>
+          </w:p>
+        </w:tc>
+        <w:tc>
+          <w:tcPr/>
+          <w:p>
+            <w:pPr>
+              <w:pStyle w:val="Compact"/>
+            </w:pPr>
+            <w:r>
+              <w:t xml:space="preserve">2/2</w:t>
+            </w:r>
+          </w:p>
+        </w:tc>
+      </w:tr>
+      <w:tr>
+        <w:tc>
+          <w:tcPr/>
+          <w:p>
+            <w:pPr>
+              <w:pStyle w:val="Compact"/>
+            </w:pPr>
             <w:r>
               <w:rPr>
                 <w:b/>
                 <w:bCs/>
               </w:rPr>
-              <w:t xml:space="preserve">retraining/fine-tuning</w:t>
-            </w:r>
-            <w:r>
-              <w:t xml:space="preserve"> </w:t>
-            </w:r>
-            <w:r>
-              <w:t xml:space="preserve">the model from the notebooks (also a rubric-listed README item).</w:t>
-            </w:r>
-          </w:p>
-        </w:tc>
-        <w:tc>
-          <w:tcPr/>
-          <w:p>
-            <w:pPr>
-              <w:pStyle w:val="Compact"/>
-            </w:pPr>
-            <w:r>
-              <w:t xml:space="preserve">2/3</w:t>
-            </w:r>
-          </w:p>
-        </w:tc>
-      </w:tr>
-      <w:tr>
-        <w:tc>
-          <w:tcPr/>
-          <w:p>
-            <w:pPr>
-              <w:pStyle w:val="Compact"/>
-            </w:pPr>
-            <w:r>
-              <w:t xml:space="preserve">Repository organization</w:t>
-            </w:r>
-          </w:p>
-        </w:tc>
-        <w:tc>
-          <w:tcPr/>
-          <w:p>
-            <w:pPr>
-              <w:pStyle w:val="Compact"/>
-            </w:pPr>
-            <w:r>
-              <w:t xml:space="preserve">2</w:t>
-            </w:r>
-          </w:p>
-        </w:tc>
-        <w:tc>
-          <w:tcPr/>
-          <w:p>
-            <w:pPr>
-              <w:pStyle w:val="Compact"/>
-            </w:pPr>
-            <w:r>
-              <w:t xml:space="preserve">Clean, deliberately isolated components (</w:t>
-            </w:r>
-            <w:r>
-              <w:rPr>
-                <w:rStyle w:val="VerbatimChar"/>
-              </w:rPr>
-              <w:t xml:space="preserve">video_detection/</w:t>
-            </w:r>
-            <w:r>
-              <w:t xml:space="preserve">,</w:t>
-            </w:r>
-            <w:r>
-              <w:t xml:space="preserve"> </w:t>
-            </w:r>
-            <w:r>
-              <w:rPr>
-                <w:rStyle w:val="VerbatimChar"/>
-              </w:rPr>
-              <w:t xml:space="preserve">streamlit_app/</w:t>
-            </w:r>
-            <w:r>
-              <w:t xml:space="preserve"> </w:t>
-            </w:r>
-            <w:r>
-              <w:t xml:space="preserve">each explicitly documented as read-only consumers of the trained model, never touching</w:t>
-            </w:r>
-            <w:r>
-              <w:t xml:space="preserve"> </w:t>
-            </w:r>
-            <w:r>
-              <w:rPr>
-                <w:rStyle w:val="VerbatimChar"/>
-              </w:rPr>
-              <w:t xml:space="preserve">bot.py</w:t>
-            </w:r>
-            <w:r>
-              <w:t xml:space="preserve">), consistent naming, no dead/orphaned files.</w:t>
-            </w:r>
-          </w:p>
-        </w:tc>
-        <w:tc>
-          <w:tcPr/>
-          <w:p>
-            <w:pPr>
-              <w:pStyle w:val="Compact"/>
-            </w:pPr>
-            <w:r>
-              <w:t xml:space="preserve">2/2</w:t>
-            </w:r>
-          </w:p>
-        </w:tc>
-      </w:tr>
-      <w:tr>
-        <w:tc>
-          <w:tcPr/>
-          <w:p>
-            <w:pPr>
-              <w:pStyle w:val="Compact"/>
-            </w:pPr>
-            <w:r>
-              <w:t xml:space="preserve">Reproducibility evidence</w:t>
-            </w:r>
-          </w:p>
-        </w:tc>
-        <w:tc>
-          <w:tcPr/>
-          <w:p>
-            <w:pPr>
-              <w:pStyle w:val="Compact"/>
-            </w:pPr>
-            <w:r>
-              <w:t xml:space="preserve">2</w:t>
-            </w:r>
-          </w:p>
-        </w:tc>
-        <w:tc>
-          <w:tcPr/>
-          <w:p>
-            <w:pPr>
-              <w:pStyle w:val="Compact"/>
-            </w:pPr>
-            <w:r>
-              <w:t xml:space="preserve">Multiple independent, verified reproduction paths: the live public web app (verified rendering today), and local run instructions for the bot/CLI/web app all confirmed working during development.</w:t>
-            </w:r>
-          </w:p>
-        </w:tc>
-        <w:tc>
-          <w:tcPr/>
-          <w:p>
-            <w:pPr>
-              <w:pStyle w:val="Compact"/>
-            </w:pPr>
-            <w:r>
-              <w:t xml:space="preserve">2/2</w:t>
-            </w:r>
-          </w:p>
-        </w:tc>
-      </w:tr>
-      <w:tr>
+              <w:t xml:space="preserve">Total</w:t>
+            </w:r>
+          </w:p>
+        </w:tc>
         <w:tc>
           <w:tcPr/>
           <w:p>
@@ -3639,8 +3641,16 @@
                 <w:b/>
                 <w:bCs/>
               </w:rPr>
-              <w:t xml:space="preserve">Total</w:t>
-            </w:r>
+              <w:t xml:space="preserve">10</w:t>
+            </w:r>
+          </w:p>
+        </w:tc>
+        <w:tc>
+          <w:tcPr/>
+          <w:p>
+            <w:pPr>
+              <w:pStyle w:val="Compact"/>
+            </w:pPr>
           </w:p>
         </w:tc>
         <w:tc>
@@ -3654,30 +3664,7 @@
                 <w:b/>
                 <w:bCs/>
               </w:rPr>
-              <w:t xml:space="preserve">10</w:t>
-            </w:r>
-          </w:p>
-        </w:tc>
-        <w:tc>
-          <w:tcPr/>
-          <w:p>
-            <w:pPr>
-              <w:pStyle w:val="Compact"/>
-            </w:pPr>
-          </w:p>
-        </w:tc>
-        <w:tc>
-          <w:tcPr/>
-          <w:p>
-            <w:pPr>
-              <w:pStyle w:val="Compact"/>
-            </w:pPr>
-            <w:r>
-              <w:rPr>
-                <w:b/>
-                <w:bCs/>
-              </w:rPr>
-              <w:t xml:space="preserve">8/10 today — see checklist to close the gap</w:t>
+              <w:t xml:space="preserve">10/10</w:t>
             </w:r>
           </w:p>
         </w:tc>
@@ -3697,7 +3684,23 @@
         <w:pStyle w:val="FirstParagraph"/>
       </w:pPr>
       <w:r>
-        <w:t xml:space="preserve">The rubric requires the repository README to contain all 16 of the following. Cross-checked against the current</w:t>
+        <w:t xml:space="preserve">The rubric requires the repository README to contain all 16 of the following.</w:t>
+      </w:r>
+      <w:r>
+        <w:t xml:space="preserve"> </w:t>
+      </w:r>
+      <w:r>
+        <w:rPr>
+          <w:b/>
+          <w:bCs/>
+        </w:rPr>
+        <w:t xml:space="preserve">Status as of 2026-08-18: all 16 present</w:t>
+      </w:r>
+      <w:r>
+        <w:t xml:space="preserve"> </w:t>
+      </w:r>
+      <w:r>
+        <w:t xml:space="preserve">— 8 items were found missing or only implied while preparing this document, and</w:t>
       </w:r>
       <w:r>
         <w:t xml:space="preserve"> </w:t>
@@ -3709,7 +3712,10 @@
         <w:t xml:space="preserve">README.md</w:t>
       </w:r>
       <w:r>
-        <w:t xml:space="preserve">:</w:t>
+        <w:t xml:space="preserve"> </w:t>
+      </w:r>
+      <w:r>
+        <w:t xml:space="preserve">was updated the same day to close every one of them.</w:t>
       </w:r>
     </w:p>
     <w:tbl>
@@ -3827,16 +3833,7 @@
               <w:pStyle w:val="Compact"/>
             </w:pPr>
             <w:r>
-              <w:t xml:space="preserve">✅ Present (informal, in</w:t>
-            </w:r>
-            <w:r>
-              <w:t xml:space="preserve"> </w:t>
-            </w:r>
-            <w:r>
-              <w:t xml:space="preserve">“What it does”</w:t>
-            </w:r>
-            <w:r>
-              <w:t xml:space="preserve">)</w:t>
+              <w:t xml:space="preserve">✅ Present</w:t>
             </w:r>
           </w:p>
         </w:tc>
@@ -3871,23 +3868,7 @@
               <w:pStyle w:val="Compact"/>
             </w:pPr>
             <w:r>
-              <w:t xml:space="preserve">❌</w:t>
-            </w:r>
-            <w:r>
-              <w:t xml:space="preserve"> </w:t>
-            </w:r>
-            <w:r>
-              <w:rPr>
-                <w:b/>
-                <w:bCs/>
-              </w:rPr>
-              <w:t xml:space="preserve">Missing</w:t>
-            </w:r>
-            <w:r>
-              <w:t xml:space="preserve"> </w:t>
-            </w:r>
-            <w:r>
-              <w:t xml:space="preserve">— should state</w:t>
+              <w:t xml:space="preserve">✅ Closed 2026-08-18 — states</w:t>
             </w:r>
             <w:r>
               <w:t xml:space="preserve"> </w:t>
@@ -3969,13 +3950,7 @@
               <w:pStyle w:val="Compact"/>
             </w:pPr>
             <w:r>
-              <w:t xml:space="preserve">⚠️ Implied, not explicitly labeled (e.g. </w:t>
-            </w:r>
-            <w:r>
-              <w:t xml:space="preserve">“200-class image classification + object detection/tracking”</w:t>
-            </w:r>
-            <w:r>
-              <w:t xml:space="preserve">)</w:t>
+              <w:t xml:space="preserve">✅ Closed 2026-08-18 — explicit label added</w:t>
             </w:r>
           </w:p>
         </w:tc>
@@ -4010,13 +3985,7 @@
               <w:pStyle w:val="Compact"/>
             </w:pPr>
             <w:r>
-              <w:t xml:space="preserve">✅ Present (</w:t>
-            </w:r>
-            <w:r>
-              <w:t xml:space="preserve">“How it’s built, stage by stage”</w:t>
-            </w:r>
-            <w:r>
-              <w:t xml:space="preserve">)</w:t>
+              <w:t xml:space="preserve">✅ Present</w:t>
             </w:r>
           </w:p>
         </w:tc>
@@ -4051,7 +4020,19 @@
               <w:pStyle w:val="Compact"/>
             </w:pPr>
             <w:r>
-              <w:t xml:space="preserve">⚠️ Present but folded into the stage list, not a dedicated item</w:t>
+              <w:t xml:space="preserve">✅ Closed 2026-08-18 — now a dedicated</w:t>
+            </w:r>
+            <w:r>
+              <w:t xml:space="preserve"> </w:t>
+            </w:r>
+            <w:r>
+              <w:t xml:space="preserve">“Models and approaches tested”</w:t>
+            </w:r>
+            <w:r>
+              <w:t xml:space="preserve"> </w:t>
+            </w:r>
+            <w:r>
+              <w:t xml:space="preserve">section</w:t>
             </w:r>
           </w:p>
         </w:tc>
@@ -4121,7 +4102,7 @@
               <w:pStyle w:val="Compact"/>
             </w:pPr>
             <w:r>
-              <w:t xml:space="preserve">✅ Present (results table)</w:t>
+              <w:t xml:space="preserve">✅ Present</w:t>
             </w:r>
           </w:p>
         </w:tc>
@@ -4191,23 +4172,19 @@
               <w:pStyle w:val="Compact"/>
             </w:pPr>
             <w:r>
-              <w:t xml:space="preserve">❌</w:t>
-            </w:r>
-            <w:r>
-              <w:t xml:space="preserve"> </w:t>
-            </w:r>
-            <w:r>
-              <w:rPr>
-                <w:b/>
-                <w:bCs/>
-              </w:rPr>
-              <w:t xml:space="preserve">Missing</w:t>
-            </w:r>
-            <w:r>
-              <w:t xml:space="preserve"> </w:t>
-            </w:r>
-            <w:r>
-              <w:t xml:space="preserve">— README only documents running the trained model, not retraining it (which notebooks, which order, Colab vs. Kaggle)</w:t>
+              <w:t xml:space="preserve">✅ Closed 2026-08-18 — new</w:t>
+            </w:r>
+            <w:r>
+              <w:t xml:space="preserve"> </w:t>
+            </w:r>
+            <w:r>
+              <w:t xml:space="preserve">“Training or fine-tuning the model”</w:t>
+            </w:r>
+            <w:r>
+              <w:t xml:space="preserve"> </w:t>
+            </w:r>
+            <w:r>
+              <w:t xml:space="preserve">section (notebook order, Colab vs. Kaggle)</w:t>
             </w:r>
           </w:p>
         </w:tc>
@@ -4277,35 +4254,19 @@
               <w:pStyle w:val="Compact"/>
             </w:pPr>
             <w:r>
-              <w:t xml:space="preserve">❌</w:t>
-            </w:r>
-            <w:r>
-              <w:t xml:space="preserve"> </w:t>
-            </w:r>
-            <w:r>
-              <w:rPr>
-                <w:b/>
-                <w:bCs/>
-              </w:rPr>
-              <w:t xml:space="preserve">Missing</w:t>
-            </w:r>
-            <w:r>
-              <w:t xml:space="preserve"> </w:t>
-            </w:r>
-            <w:r>
-              <w:t xml:space="preserve">— no concrete</w:t>
-            </w:r>
-            <w:r>
-              <w:t xml:space="preserve"> </w:t>
-            </w:r>
-            <w:r>
-              <w:t xml:space="preserve">“here’s a sample photo in, sign name + confidence out”</w:t>
-            </w:r>
-            <w:r>
-              <w:t xml:space="preserve"> </w:t>
-            </w:r>
-            <w:r>
-              <w:t xml:space="preserve">shown</w:t>
+              <w:t xml:space="preserve">✅ Closed 2026-08-18 — new</w:t>
+            </w:r>
+            <w:r>
+              <w:t xml:space="preserve"> </w:t>
+            </w:r>
+            <w:r>
+              <w:t xml:space="preserve">“Example input and output”</w:t>
+            </w:r>
+            <w:r>
+              <w:t xml:space="preserve"> </w:t>
+            </w:r>
+            <w:r>
+              <w:t xml:space="preserve">section</w:t>
             </w:r>
           </w:p>
         </w:tc>
@@ -4340,44 +4301,19 @@
               <w:pStyle w:val="Compact"/>
             </w:pPr>
             <w:r>
-              <w:t xml:space="preserve">❌</w:t>
-            </w:r>
-            <w:r>
-              <w:t xml:space="preserve"> </w:t>
-            </w:r>
-            <w:r>
-              <w:rPr>
-                <w:b/>
-                <w:bCs/>
-              </w:rPr>
-              <w:t xml:space="preserve">Missing from README itself</w:t>
-            </w:r>
-            <w:r>
-              <w:t xml:space="preserve"> </w:t>
-            </w:r>
-            <w:r>
-              <w:t xml:space="preserve">— extensively documented in</w:t>
-            </w:r>
-            <w:r>
-              <w:t xml:space="preserve"> </w:t>
-            </w:r>
-            <w:r>
-              <w:rPr>
-                <w:rStyle w:val="VerbatimChar"/>
-              </w:rPr>
-              <w:t xml:space="preserve">PROJECT_STATUS.md</w:t>
-            </w:r>
-            <w:r>
-              <w:t xml:space="preserve">/</w:t>
-            </w:r>
-            <w:r>
-              <w:rPr>
-                <w:rStyle w:val="VerbatimChar"/>
-              </w:rPr>
-              <w:t xml:space="preserve">video_detection/README.md</w:t>
-            </w:r>
-            <w:r>
-              <w:t xml:space="preserve">, but not surfaced in the root README the rubric is checking</w:t>
+              <w:t xml:space="preserve">✅ Closed 2026-08-18 — new</w:t>
+            </w:r>
+            <w:r>
+              <w:t xml:space="preserve"> </w:t>
+            </w:r>
+            <w:r>
+              <w:t xml:space="preserve">“Known limitations”</w:t>
+            </w:r>
+            <w:r>
+              <w:t xml:space="preserve"> </w:t>
+            </w:r>
+            <w:r>
+              <w:t xml:space="preserve">section in the README itself</w:t>
             </w:r>
           </w:p>
         </w:tc>
@@ -4412,23 +4348,7 @@
               <w:pStyle w:val="Compact"/>
             </w:pPr>
             <w:r>
-              <w:t xml:space="preserve">❌</w:t>
-            </w:r>
-            <w:r>
-              <w:t xml:space="preserve"> </w:t>
-            </w:r>
-            <w:r>
-              <w:rPr>
-                <w:b/>
-                <w:bCs/>
-              </w:rPr>
-              <w:t xml:space="preserve">Missing entirely</w:t>
-            </w:r>
-            <w:r>
-              <w:t xml:space="preserve"> </w:t>
-            </w:r>
-            <w:r>
-              <w:t xml:space="preserve">— see Criterion 7 below for the content to add</w:t>
+              <w:t xml:space="preserve">✅ Closed 2026-08-18 — new section, content mirrors Criterion 7 below</w:t>
             </w:r>
           </w:p>
         </w:tc>
@@ -4463,23 +4383,7 @@
               <w:pStyle w:val="Compact"/>
             </w:pPr>
             <w:r>
-              <w:t xml:space="preserve">❌</w:t>
-            </w:r>
-            <w:r>
-              <w:t xml:space="preserve"> </w:t>
-            </w:r>
-            <w:r>
-              <w:rPr>
-                <w:b/>
-                <w:bCs/>
-              </w:rPr>
-              <w:t xml:space="preserve">Missing</w:t>
-            </w:r>
-            <w:r>
-              <w:t xml:space="preserve"> </w:t>
-            </w:r>
-            <w:r>
-              <w:t xml:space="preserve">—</w:t>
+              <w:t xml:space="preserve">✅ Closed 2026-08-18 —</w:t>
             </w:r>
             <w:r>
               <w:t xml:space="preserve"> </w:t>
@@ -4491,39 +4395,12 @@
               <w:t xml:space="preserve"> </w:t>
             </w:r>
             <w:r>
-              <w:t xml:space="preserve">does not currently appear anywhere in</w:t>
-            </w:r>
-            <w:r>
-              <w:t xml:space="preserve"> </w:t>
-            </w:r>
-            <w:r>
-              <w:rPr>
-                <w:rStyle w:val="VerbatimChar"/>
-              </w:rPr>
-              <w:t xml:space="preserve">README.md</w:t>
+              <w:t xml:space="preserve">now stated directly</w:t>
             </w:r>
           </w:p>
         </w:tc>
       </w:tr>
     </w:tbl>
-    <w:p>
-      <w:pPr>
-        <w:pStyle w:val="BodyText"/>
-      </w:pPr>
-      <w:r>
-        <w:rPr>
-          <w:b/>
-          <w:bCs/>
-        </w:rPr>
-        <w:t xml:space="preserve">This is the single most concrete, easily-fixable gap found while preparing this document.</w:t>
-      </w:r>
-      <w:r>
-        <w:t xml:space="preserve"> </w:t>
-      </w:r>
-      <w:r>
-        <w:t xml:space="preserve">Closing items 3, 5, 7, 11, 13, 14, 15, and 16 is straightforward (all the underlying facts already exist elsewhere in the project) and would move this criterion from ~8/10 to a clean 9–10/10.</w:t>
-      </w:r>
-    </w:p>
     <w:p>
       <w:pPr>
         <w:pStyle w:val="BodyText"/>
@@ -5087,22 +4964,10 @@
           <w:b/>
           <w:bCs/>
         </w:rPr>
-        <w:t xml:space="preserve">Recommended action</w:t>
-      </w:r>
-      <w:r>
-        <w:t xml:space="preserve">: add a short</w:t>
-      </w:r>
-      <w:r>
-        <w:t xml:space="preserve"> </w:t>
-      </w:r>
-      <w:r>
-        <w:t xml:space="preserve">“Responsible AI”</w:t>
-      </w:r>
-      <w:r>
-        <w:t xml:space="preserve"> </w:t>
-      </w:r>
-      <w:r>
-        <w:t xml:space="preserve">section to</w:t>
+        <w:t xml:space="preserve">Status</w:t>
+      </w:r>
+      <w:r>
+        <w:t xml:space="preserve">: this content was added to</w:t>
       </w:r>
       <w:r>
         <w:t xml:space="preserve"> </w:t>
@@ -5117,7 +4982,31 @@
         <w:t xml:space="preserve"> </w:t>
       </w:r>
       <w:r>
-        <w:t xml:space="preserve">(rubric item 15) using the three paragraphs above — this closes both the Criterion 6 README gap and gives Criterion 7 a real, citable location rather than scattered evidence.</w:t>
+        <w:t xml:space="preserve">as its own</w:t>
+      </w:r>
+      <w:r>
+        <w:t xml:space="preserve"> </w:t>
+      </w:r>
+      <w:r>
+        <w:t xml:space="preserve">“Responsible AI considerations”</w:t>
+      </w:r>
+      <w:r>
+        <w:t xml:space="preserve"> </w:t>
+      </w:r>
+      <w:r>
+        <w:t xml:space="preserve">section on 2026-08-18, closing both the Criterion 6 README gap and giving Criterion 7 a real, citable location rather than scattered evidence. The two named engineering gaps (capture-condition bias unaudited, incidental PII in video unaddressed) are now documented, not resolved — resolving them is separate follow-up work, listed in the</w:t>
+      </w:r>
+      <w:r>
+        <w:t xml:space="preserve"> </w:t>
+      </w:r>
+      <w:r>
+        <w:t xml:space="preserve">“what would you improve”</w:t>
+      </w:r>
+      <w:r>
+        <w:t xml:space="preserve"> </w:t>
+      </w:r>
+      <w:r>
+        <w:t xml:space="preserve">answer below.</w:t>
       </w:r>
     </w:p>
     <w:p>
@@ -5612,7 +5501,7 @@
               <w:pStyle w:val="Compact"/>
             </w:pPr>
             <w:r>
-              <w:t xml:space="preserve">8 (→ 9–10 after closing the README checklist)</w:t>
+              <w:t xml:space="preserve">10</w:t>
             </w:r>
           </w:p>
         </w:tc>
@@ -5759,10 +5648,7 @@
                 <w:b/>
                 <w:bCs/>
               </w:rPr>
-              <w:t xml:space="preserve">~83–84</w:t>
-            </w:r>
-            <w:r>
-              <w:t xml:space="preserve">, ~87–88 after closing the README/Responsible-AI gap</w:t>
+              <w:t xml:space="preserve">~85–87</w:t>
             </w:r>
           </w:p>
         </w:tc>
@@ -5773,7 +5659,7 @@
         <w:pStyle w:val="BodyText"/>
       </w:pPr>
       <w:r>
-        <w:t xml:space="preserve">Even before closing the one concrete gap found (the README checklist) and before the live-delivery-dependent Criterion 8, this self-assessment sits solidly in the</w:t>
+        <w:t xml:space="preserve">Before the live-delivery-dependent Criterion 8, this self-assessment sits solidly in the</w:t>
       </w:r>
       <w:r>
         <w:t xml:space="preserve"> </w:t>

</xml_diff>